<commit_message>
actualizado UML, RAZA de paso a animal como metodo concreto, refactor de la funcionalidad turno para usar los metodos poliformicos que agrego Faby TKM :( Se agrego en tipoTurno get de colores
</commit_message>
<xml_diff>
--- a/informe/INFORME_TECNICO_HappyPaws.docx
+++ b/informe/INFORME_TECNICO_HappyPaws.docx
@@ -7123,7 +7123,7 @@
       <w:r>
         <w:drawing>
           <wp:inline xmlns:a="http://schemas.openxmlformats.org/drawingml/2006/main" xmlns:pic="http://schemas.openxmlformats.org/drawingml/2006/picture">
-            <wp:extent cx="5943600" cy="5202888"/>
+            <wp:extent cx="5943600" cy="5253326"/>
             <wp:docPr id="1" name="Picture 1"/>
             <wp:cNvGraphicFramePr>
               <a:graphicFrameLocks noChangeAspect="1"/>
@@ -7144,7 +7144,7 @@
                   <pic:spPr>
                     <a:xfrm>
                       <a:off x="0" y="0"/>
-                      <a:ext cx="5943600" cy="5202888"/>
+                      <a:ext cx="5943600" cy="5253326"/>
                     </a:xfrm>
                     <a:prstGeom prst="rect"/>
                   </pic:spPr>

</xml_diff>

<commit_message>
actualizacion UML e informe tecnico para el profe
</commit_message>
<xml_diff>
--- a/informe/INFORME_TECNICO_HappyPaws.docx
+++ b/informe/INFORME_TECNICO_HappyPaws.docx
@@ -262,7 +262,7 @@
           <w:rFonts w:ascii="Calibri" w:hAnsi="Calibri"/>
           <w:sz w:val="22"/>
         </w:rPr>
-        <w:t xml:space="preserve"> de datos realistas (4 veterinarios, 4 clientes, 10 mascotas, 16 turnos, 8 medicamentos y un portal de adopciones activo) y una batería de </w:t>
+        <w:t xml:space="preserve"> de datos realistas (4 veterinarios, 4 clientes, 17 mascotas, 27 turnos, 11 medicamentos/vacunas en catálogo y un portal de adopciones activo) y una batería de </w:t>
       </w:r>
       <w:r>
         <w:rPr>
@@ -270,7 +270,7 @@
           <w:b/>
           <w:sz w:val="22"/>
         </w:rPr>
-        <w:t>59 pruebas integrales automatizadas</w:t>
+        <w:t>62 pruebas integrales automatizadas</w:t>
       </w:r>
       <w:r>
         <w:rPr>
@@ -1416,7 +1416,7 @@
                 <w:rFonts w:ascii="Calibri" w:hAnsi="Calibri"/>
                 <w:sz w:val="20"/>
               </w:rPr>
-              <w:t xml:space="preserve"> y </w:t>
+              <w:t xml:space="preserve">, </w:t>
             </w:r>
             <w:r>
               <w:rPr>
@@ -1442,6 +1442,38 @@
                 <w:shd w:val="clear" w:color="auto" w:fill="F4F4F4"/>
               </w:rPr>
               <w:t>Gato</w:t>
+            </w:r>
+            <w:r>
+              <w:rPr>
+                <w:rFonts w:ascii="Calibri" w:hAnsi="Calibri"/>
+                <w:sz w:val="20"/>
+              </w:rPr>
+              <w:t xml:space="preserve"> y </w:t>
+            </w:r>
+            <w:r>
+              <w:rPr>
+                <w:rFonts w:ascii="Consolas" w:hAnsi="Consolas"/>
+                <w:sz w:val="20"/>
+                <w:rFonts w:ascii="Consolas" w:hAnsi="Consolas"/>
+                <w:shd w:val="clear" w:color="auto" w:fill="F4F4F4"/>
+              </w:rPr>
+              <w:t>HERBIBORO</w:t>
+            </w:r>
+            <w:r>
+              <w:rPr>
+                <w:rFonts w:ascii="Calibri" w:hAnsi="Calibri"/>
+                <w:sz w:val="20"/>
+              </w:rPr>
+              <w:t xml:space="preserve"> en </w:t>
+            </w:r>
+            <w:r>
+              <w:rPr>
+                <w:rFonts w:ascii="Consolas" w:hAnsi="Consolas"/>
+                <w:sz w:val="20"/>
+                <w:rFonts w:ascii="Consolas" w:hAnsi="Consolas"/>
+                <w:shd w:val="clear" w:color="auto" w:fill="F4F4F4"/>
+              </w:rPr>
+              <w:t>Conejo</w:t>
             </w:r>
             <w:r>
               <w:rPr>
@@ -3010,7 +3042,7 @@
                 <w:rFonts w:ascii="Calibri" w:hAnsi="Calibri"/>
                 <w:sz w:val="20"/>
               </w:rPr>
-              <w:t>✅ (59/59)</w:t>
+              <w:t>✅ (62/62)</w:t>
             </w:r>
           </w:p>
         </w:tc>
@@ -3214,10 +3246,16 @@
               <w:br/>
               <w:t>Animal  (abstract) ──┬── Perro</w:t>
               <w:br/>
-              <w:t xml:space="preserve">                    └── Gato</w:t>
+              <w:t xml:space="preserve">                    ├── Gato</w:t>
+              <w:br/>
+              <w:t xml:space="preserve">                    ├── Conejo</w:t>
+              <w:br/>
+              <w:t xml:space="preserve">                    ├── Loro</w:t>
+              <w:br/>
+              <w:t xml:space="preserve">                    └── Tortuga</w:t>
               <w:br/>
               <w:br/>
-              <w:t>Medicamento ─────────── Vacuna</w:t>
+              <w:t>Medicamento ─── Vacuna</w:t>
             </w:r>
           </w:p>
         </w:tc>
@@ -3243,7 +3281,7 @@
           <w:rFonts w:ascii="Calibri" w:hAnsi="Calibri"/>
           <w:sz w:val="22"/>
         </w:rPr>
-        <w:t xml:space="preserve"> agrupa DNI, nombre, apellido, teléfono, email y dirección.</w:t>
+        <w:t xml:space="preserve"> agrupa DNI, nombre, apellido, celular y dirección.</w:t>
       </w:r>
     </w:p>
     <w:p>
@@ -3266,7 +3304,7 @@
           <w:rFonts w:ascii="Calibri" w:hAnsi="Calibri"/>
           <w:sz w:val="22"/>
         </w:rPr>
-        <w:t xml:space="preserve"> agrupa nombre, edad, peso, sexo, responsable e historial clínico.</w:t>
+        <w:t xml:space="preserve"> agrupa nombre, fecha de nacimiento, sexo, peso, responsable, raza e historial clínico.</w:t>
       </w:r>
     </w:p>
     <w:p>
@@ -3305,7 +3343,7 @@
           <w:rFonts w:ascii="Calibri" w:hAnsi="Calibri"/>
           <w:sz w:val="22"/>
         </w:rPr>
-        <w:t xml:space="preserve"> agregando fechas de aplicación y vencimiento.</w:t>
+        <w:t xml:space="preserve"> agregando la vigencia en días.</w:t>
       </w:r>
     </w:p>
     <w:p>
@@ -3395,7 +3433,7 @@
           <w:rFonts w:ascii="Calibri" w:hAnsi="Calibri"/>
           <w:sz w:val="22"/>
         </w:rPr>
-        <w:t xml:space="preserve"> y </w:t>
+        <w:t xml:space="preserve">, </w:t>
       </w:r>
       <w:r>
         <w:rPr>
@@ -3405,6 +3443,22 @@
           <w:shd w:val="clear" w:color="auto" w:fill="F4F4F4"/>
         </w:rPr>
         <w:t>CARNIVORO_ESTRICTO</w:t>
+      </w:r>
+      <w:r>
+        <w:rPr>
+          <w:rFonts w:ascii="Calibri" w:hAnsi="Calibri"/>
+          <w:sz w:val="22"/>
+        </w:rPr>
+        <w:t xml:space="preserve"> y </w:t>
+      </w:r>
+      <w:r>
+        <w:rPr>
+          <w:rFonts w:ascii="Consolas" w:hAnsi="Consolas"/>
+          <w:sz w:val="22"/>
+          <w:rFonts w:ascii="Consolas" w:hAnsi="Consolas"/>
+          <w:shd w:val="clear" w:color="auto" w:fill="F4F4F4"/>
+        </w:rPr>
+        <w:t>HERBIBORO</w:t>
       </w:r>
       <w:r>
         <w:rPr>
@@ -3449,7 +3503,103 @@
           <w:rFonts w:ascii="Calibri" w:hAnsi="Calibri"/>
           <w:sz w:val="22"/>
         </w:rPr>
-        <w:t xml:space="preserve"> su tipo de alimentación y la respuesta depende del tipo concreto, sin necesidad de </w:t>
+        <w:t xml:space="preserve"> su tipo de alimentación y la respuesta depende del tipo concreto (por ejemplo, </w:t>
+      </w:r>
+      <w:r>
+        <w:rPr>
+          <w:rFonts w:ascii="Consolas" w:hAnsi="Consolas"/>
+          <w:sz w:val="22"/>
+          <w:rFonts w:ascii="Consolas" w:hAnsi="Consolas"/>
+          <w:shd w:val="clear" w:color="auto" w:fill="F4F4F4"/>
+        </w:rPr>
+        <w:t>OMNIVORO</w:t>
+      </w:r>
+      <w:r>
+        <w:rPr>
+          <w:rFonts w:ascii="Calibri" w:hAnsi="Calibri"/>
+          <w:sz w:val="22"/>
+        </w:rPr>
+        <w:t xml:space="preserve"> en </w:t>
+      </w:r>
+      <w:r>
+        <w:rPr>
+          <w:rFonts w:ascii="Consolas" w:hAnsi="Consolas"/>
+          <w:sz w:val="22"/>
+          <w:rFonts w:ascii="Consolas" w:hAnsi="Consolas"/>
+          <w:shd w:val="clear" w:color="auto" w:fill="F4F4F4"/>
+        </w:rPr>
+        <w:t>Perro</w:t>
+      </w:r>
+      <w:r>
+        <w:rPr>
+          <w:rFonts w:ascii="Calibri" w:hAnsi="Calibri"/>
+          <w:sz w:val="22"/>
+        </w:rPr>
+        <w:t xml:space="preserve">, </w:t>
+      </w:r>
+      <w:r>
+        <w:rPr>
+          <w:rFonts w:ascii="Consolas" w:hAnsi="Consolas"/>
+          <w:sz w:val="22"/>
+          <w:rFonts w:ascii="Consolas" w:hAnsi="Consolas"/>
+          <w:shd w:val="clear" w:color="auto" w:fill="F4F4F4"/>
+        </w:rPr>
+        <w:t>CARNIVORO_ESTRICTO</w:t>
+      </w:r>
+      <w:r>
+        <w:rPr>
+          <w:rFonts w:ascii="Calibri" w:hAnsi="Calibri"/>
+          <w:sz w:val="22"/>
+        </w:rPr>
+        <w:t xml:space="preserve"> en </w:t>
+      </w:r>
+      <w:r>
+        <w:rPr>
+          <w:rFonts w:ascii="Consolas" w:hAnsi="Consolas"/>
+          <w:sz w:val="22"/>
+          <w:rFonts w:ascii="Consolas" w:hAnsi="Consolas"/>
+          <w:shd w:val="clear" w:color="auto" w:fill="F4F4F4"/>
+        </w:rPr>
+        <w:t>Gato</w:t>
+      </w:r>
+      <w:r>
+        <w:rPr>
+          <w:rFonts w:ascii="Calibri" w:hAnsi="Calibri"/>
+          <w:sz w:val="22"/>
+        </w:rPr>
+        <w:t xml:space="preserve"> y </w:t>
+      </w:r>
+      <w:r>
+        <w:rPr>
+          <w:rFonts w:ascii="Consolas" w:hAnsi="Consolas"/>
+          <w:sz w:val="22"/>
+          <w:rFonts w:ascii="Consolas" w:hAnsi="Consolas"/>
+          <w:shd w:val="clear" w:color="auto" w:fill="F4F4F4"/>
+        </w:rPr>
+        <w:t>HERBIBORO</w:t>
+      </w:r>
+      <w:r>
+        <w:rPr>
+          <w:rFonts w:ascii="Calibri" w:hAnsi="Calibri"/>
+          <w:sz w:val="22"/>
+        </w:rPr>
+        <w:t xml:space="preserve"> en </w:t>
+      </w:r>
+      <w:r>
+        <w:rPr>
+          <w:rFonts w:ascii="Consolas" w:hAnsi="Consolas"/>
+          <w:sz w:val="22"/>
+          <w:rFonts w:ascii="Consolas" w:hAnsi="Consolas"/>
+          <w:shd w:val="clear" w:color="auto" w:fill="F4F4F4"/>
+        </w:rPr>
+        <w:t>Conejo</w:t>
+      </w:r>
+      <w:r>
+        <w:rPr>
+          <w:rFonts w:ascii="Calibri" w:hAnsi="Calibri"/>
+          <w:sz w:val="22"/>
+        </w:rPr>
+        <w:t xml:space="preserve">), sin necesidad de </w:t>
       </w:r>
       <w:r>
         <w:rPr>
@@ -3487,7 +3637,7 @@
           <w:rFonts w:ascii="Calibri" w:hAnsi="Calibri"/>
           <w:sz w:val="22"/>
         </w:rPr>
-        <w:t xml:space="preserve">: si en el futuro se agrega la clase </w:t>
+        <w:t xml:space="preserve">: al incorporar nuevas subclases como </w:t>
       </w:r>
       <w:r>
         <w:rPr>
@@ -3496,14 +3646,14 @@
           <w:rFonts w:ascii="Consolas" w:hAnsi="Consolas"/>
           <w:shd w:val="clear" w:color="auto" w:fill="F4F4F4"/>
         </w:rPr>
-        <w:t>Ave</w:t>
-      </w:r>
-      <w:r>
-        <w:rPr>
-          <w:rFonts w:ascii="Calibri" w:hAnsi="Calibri"/>
-          <w:sz w:val="22"/>
-        </w:rPr>
-        <w:t xml:space="preserve"> o </w:t>
+        <w:t>Conejo</w:t>
+      </w:r>
+      <w:r>
+        <w:rPr>
+          <w:rFonts w:ascii="Calibri" w:hAnsi="Calibri"/>
+          <w:sz w:val="22"/>
+        </w:rPr>
+        <w:t xml:space="preserve">, </w:t>
       </w:r>
       <w:r>
         <w:rPr>
@@ -3512,14 +3662,30 @@
           <w:rFonts w:ascii="Consolas" w:hAnsi="Consolas"/>
           <w:shd w:val="clear" w:color="auto" w:fill="F4F4F4"/>
         </w:rPr>
-        <w:t>Reptil</w:t>
-      </w:r>
-      <w:r>
-        <w:rPr>
-          <w:rFonts w:ascii="Calibri" w:hAnsi="Calibri"/>
-          <w:sz w:val="22"/>
-        </w:rPr>
-        <w:t>, basta sobrescribir el método. El código cliente no cambia.</w:t>
+        <w:t>Loro</w:t>
+      </w:r>
+      <w:r>
+        <w:rPr>
+          <w:rFonts w:ascii="Calibri" w:hAnsi="Calibri"/>
+          <w:sz w:val="22"/>
+        </w:rPr>
+        <w:t xml:space="preserve"> y </w:t>
+      </w:r>
+      <w:r>
+        <w:rPr>
+          <w:rFonts w:ascii="Consolas" w:hAnsi="Consolas"/>
+          <w:sz w:val="22"/>
+          <w:rFonts w:ascii="Consolas" w:hAnsi="Consolas"/>
+          <w:shd w:val="clear" w:color="auto" w:fill="F4F4F4"/>
+        </w:rPr>
+        <w:t>Tortuga</w:t>
+      </w:r>
+      <w:r>
+        <w:rPr>
+          <w:rFonts w:ascii="Calibri" w:hAnsi="Calibri"/>
+          <w:sz w:val="22"/>
+        </w:rPr>
+        <w:t>, basta sobrescribir el método. El código cliente no sufre modificaciones.</w:t>
       </w:r>
     </w:p>
     <w:p>
@@ -3563,7 +3729,7 @@
           <w:rFonts w:ascii="Calibri" w:hAnsi="Calibri"/>
           <w:sz w:val="22"/>
         </w:rPr>
-        <w:t xml:space="preserve"> o </w:t>
+        <w:t xml:space="preserve">, </w:t>
       </w:r>
       <w:r>
         <w:rPr>
@@ -3579,7 +3745,103 @@
           <w:rFonts w:ascii="Calibri" w:hAnsi="Calibri"/>
           <w:sz w:val="22"/>
         </w:rPr>
-        <w:t>.</w:t>
+        <w:t xml:space="preserve">, </w:t>
+      </w:r>
+      <w:r>
+        <w:rPr>
+          <w:rFonts w:ascii="Consolas" w:hAnsi="Consolas"/>
+          <w:sz w:val="22"/>
+          <w:rFonts w:ascii="Consolas" w:hAnsi="Consolas"/>
+          <w:shd w:val="clear" w:color="auto" w:fill="F4F4F4"/>
+        </w:rPr>
+        <w:t>"Conejo"</w:t>
+      </w:r>
+      <w:r>
+        <w:rPr>
+          <w:rFonts w:ascii="Calibri" w:hAnsi="Calibri"/>
+          <w:sz w:val="22"/>
+        </w:rPr>
+        <w:t xml:space="preserve">, </w:t>
+      </w:r>
+      <w:r>
+        <w:rPr>
+          <w:rFonts w:ascii="Consolas" w:hAnsi="Consolas"/>
+          <w:sz w:val="22"/>
+          <w:rFonts w:ascii="Consolas" w:hAnsi="Consolas"/>
+          <w:shd w:val="clear" w:color="auto" w:fill="F4F4F4"/>
+        </w:rPr>
+        <w:t>"Loro"</w:t>
+      </w:r>
+      <w:r>
+        <w:rPr>
+          <w:rFonts w:ascii="Calibri" w:hAnsi="Calibri"/>
+          <w:sz w:val="22"/>
+        </w:rPr>
+        <w:t xml:space="preserve"> o </w:t>
+      </w:r>
+      <w:r>
+        <w:rPr>
+          <w:rFonts w:ascii="Consolas" w:hAnsi="Consolas"/>
+          <w:sz w:val="22"/>
+          <w:rFonts w:ascii="Consolas" w:hAnsi="Consolas"/>
+          <w:shd w:val="clear" w:color="auto" w:fill="F4F4F4"/>
+        </w:rPr>
+        <w:t>"Tortuga"</w:t>
+      </w:r>
+      <w:r>
+        <w:rPr>
+          <w:rFonts w:ascii="Calibri" w:hAnsi="Calibri"/>
+          <w:sz w:val="22"/>
+        </w:rPr>
+        <w:t xml:space="preserve">. También se definen como abstractos los métodos </w:t>
+      </w:r>
+      <w:r>
+        <w:rPr>
+          <w:rFonts w:ascii="Consolas" w:hAnsi="Consolas"/>
+          <w:sz w:val="22"/>
+          <w:rFonts w:ascii="Consolas" w:hAnsi="Consolas"/>
+          <w:shd w:val="clear" w:color="auto" w:fill="F4F4F4"/>
+        </w:rPr>
+        <w:t>getColorInicioHexActivo()</w:t>
+      </w:r>
+      <w:r>
+        <w:rPr>
+          <w:rFonts w:ascii="Calibri" w:hAnsi="Calibri"/>
+          <w:sz w:val="22"/>
+        </w:rPr>
+        <w:t xml:space="preserve"> and </w:t>
+      </w:r>
+      <w:r>
+        <w:rPr>
+          <w:rFonts w:ascii="Consolas" w:hAnsi="Consolas"/>
+          <w:sz w:val="22"/>
+          <w:rFonts w:ascii="Consolas" w:hAnsi="Consolas"/>
+          <w:shd w:val="clear" w:color="auto" w:fill="F4F4F4"/>
+        </w:rPr>
+        <w:t>getColorFinHexActivo()</w:t>
+      </w:r>
+      <w:r>
+        <w:rPr>
+          <w:rFonts w:ascii="Calibri" w:hAnsi="Calibri"/>
+          <w:sz w:val="22"/>
+        </w:rPr>
+        <w:t xml:space="preserve">, implementados polimórficamente por cada subclase de </w:t>
+      </w:r>
+      <w:r>
+        <w:rPr>
+          <w:rFonts w:ascii="Consolas" w:hAnsi="Consolas"/>
+          <w:sz w:val="22"/>
+          <w:rFonts w:ascii="Consolas" w:hAnsi="Consolas"/>
+          <w:shd w:val="clear" w:color="auto" w:fill="F4F4F4"/>
+        </w:rPr>
+        <w:t>Animal</w:t>
+      </w:r>
+      <w:r>
+        <w:rPr>
+          <w:rFonts w:ascii="Calibri" w:hAnsi="Calibri"/>
+          <w:sz w:val="22"/>
+        </w:rPr>
+        <w:t xml:space="preserve"> para definir de manera particular el color de su tarjeta en la interfaz Swing.</w:t>
       </w:r>
     </w:p>
     <w:p>
@@ -4281,19 +4543,15 @@
               </w:rPr>
               <w:t>public String generarTextoCompleto() {</w:t>
               <w:br/>
-              <w:t xml:space="preserve">    Turno t = this.turno;</w:t>
+              <w:t xml:space="preserve">    return generarEncabezado()</w:t>
               <w:br/>
-              <w:t xml:space="preserve">    return "Comprobante — " + t.getVeterinaria().getNombreNegocio()</w:t>
+              <w:t xml:space="preserve">         + generarDetallePaciente()</w:t>
               <w:br/>
-              <w:t xml:space="preserve">         + "\nPaciente: "   + t.getAnimal().getNombre()</w:t>
+              <w:t xml:space="preserve">         + generarDetalleAtencion()</w:t>
               <w:br/>
-              <w:t xml:space="preserve">         + "\nResponsable: "+ t.getAnimal().getResponsable().getNombreCompleto()</w:t>
+              <w:t xml:space="preserve">         + generarDetalleTratamiento()</w:t>
               <w:br/>
-              <w:t xml:space="preserve">         + "\nVeterinario: "+ t.getVeterinario().getNombreCompleto()</w:t>
-              <w:br/>
-              <w:t xml:space="preserve">         + "\nTipo: "       + t.getTipo().getDescripcion()</w:t>
-              <w:br/>
-              <w:t xml:space="preserve">         + "\nFecha: "      + t.getFecha() + " " + t.getHora();</w:t>
+              <w:t xml:space="preserve">         + "=========================================\n";</w:t>
               <w:br/>
               <w:t>}</w:t>
             </w:r>
@@ -4627,7 +4885,472 @@
           <w:color w:val="144B70"/>
           <w:sz w:val="32"/>
         </w:rPr>
-        <w:t>4.7 Estructura de paquetes</w:t>
+        <w:t>4.7 Patrones creacionales opcionales: Factory y Builder</w:t>
+      </w:r>
+    </w:p>
+    <w:p>
+      <w:pPr>
+        <w:ind w:firstLine="283"/>
+      </w:pPr>
+      <w:r>
+        <w:rPr>
+          <w:rFonts w:ascii="Calibri" w:hAnsi="Calibri"/>
+          <w:sz w:val="22"/>
+        </w:rPr>
+        <w:t xml:space="preserve">Para flexibilizar y desacoplar la creación de objetos del dominio (particularmente la jerarquía de </w:t>
+      </w:r>
+      <w:r>
+        <w:rPr>
+          <w:rFonts w:ascii="Consolas" w:hAnsi="Consolas"/>
+          <w:sz w:val="22"/>
+          <w:rFonts w:ascii="Consolas" w:hAnsi="Consolas"/>
+          <w:shd w:val="clear" w:color="auto" w:fill="F4F4F4"/>
+        </w:rPr>
+        <w:t>Animal</w:t>
+      </w:r>
+      <w:r>
+        <w:rPr>
+          <w:rFonts w:ascii="Calibri" w:hAnsi="Calibri"/>
+          <w:sz w:val="22"/>
+        </w:rPr>
+        <w:t xml:space="preserve">), se implementaron dos patrones creacionales en el paquete </w:t>
+      </w:r>
+      <w:r>
+        <w:rPr>
+          <w:rFonts w:ascii="Consolas" w:hAnsi="Consolas"/>
+          <w:sz w:val="22"/>
+          <w:rFonts w:ascii="Consolas" w:hAnsi="Consolas"/>
+          <w:shd w:val="clear" w:color="auto" w:fill="F4F4F4"/>
+        </w:rPr>
+        <w:t>fabrica/</w:t>
+      </w:r>
+      <w:r>
+        <w:rPr>
+          <w:rFonts w:ascii="Calibri" w:hAnsi="Calibri"/>
+          <w:sz w:val="22"/>
+        </w:rPr>
+        <w:t>:</w:t>
+      </w:r>
+    </w:p>
+    <w:p>
+      <w:pPr>
+        <w:pStyle w:val="Heading3"/>
+      </w:pPr>
+      <w:r>
+        <w:rPr>
+          <w:rFonts w:ascii="Calibri" w:hAnsi="Calibri"/>
+          <w:b/>
+          <w:color w:val="1E293B"/>
+          <w:sz w:val="26"/>
+        </w:rPr>
+        <w:t>4.7.1 Factory Dinámico con Registro (</w:t>
+      </w:r>
+      <w:r>
+        <w:rPr>
+          <w:rFonts w:ascii="Consolas" w:hAnsi="Consolas"/>
+          <w:b/>
+          <w:color w:val="1E293B"/>
+          <w:sz w:val="26"/>
+          <w:rFonts w:ascii="Consolas" w:hAnsi="Consolas"/>
+          <w:shd w:val="clear" w:color="auto" w:fill="F4F4F4"/>
+        </w:rPr>
+        <w:t>FabricaAnimalMap</w:t>
+      </w:r>
+      <w:r>
+        <w:rPr>
+          <w:rFonts w:ascii="Calibri" w:hAnsi="Calibri"/>
+          <w:b/>
+          <w:color w:val="1E293B"/>
+          <w:sz w:val="26"/>
+        </w:rPr>
+        <w:t>)</w:t>
+      </w:r>
+    </w:p>
+    <w:p>
+      <w:pPr>
+        <w:ind w:firstLine="283"/>
+      </w:pPr>
+      <w:r>
+        <w:rPr>
+          <w:rFonts w:ascii="Calibri" w:hAnsi="Calibri"/>
+          <w:sz w:val="22"/>
+        </w:rPr>
+        <w:t xml:space="preserve">El patrón </w:t>
+      </w:r>
+      <w:r>
+        <w:rPr>
+          <w:rFonts w:ascii="Calibri" w:hAnsi="Calibri"/>
+          <w:b/>
+          <w:sz w:val="22"/>
+        </w:rPr>
+        <w:t>Factory</w:t>
+      </w:r>
+      <w:r>
+        <w:rPr>
+          <w:rFonts w:ascii="Calibri" w:hAnsi="Calibri"/>
+          <w:sz w:val="22"/>
+        </w:rPr>
+        <w:t xml:space="preserve"> centraliza la instanciación de las subclases de </w:t>
+      </w:r>
+      <w:r>
+        <w:rPr>
+          <w:rFonts w:ascii="Consolas" w:hAnsi="Consolas"/>
+          <w:sz w:val="22"/>
+          <w:rFonts w:ascii="Consolas" w:hAnsi="Consolas"/>
+          <w:shd w:val="clear" w:color="auto" w:fill="F4F4F4"/>
+        </w:rPr>
+        <w:t>Animal</w:t>
+      </w:r>
+      <w:r>
+        <w:rPr>
+          <w:rFonts w:ascii="Calibri" w:hAnsi="Calibri"/>
+          <w:sz w:val="22"/>
+        </w:rPr>
+        <w:t xml:space="preserve">. A fin de evitar un bloque rígido de </w:t>
+      </w:r>
+      <w:r>
+        <w:rPr>
+          <w:rFonts w:ascii="Consolas" w:hAnsi="Consolas"/>
+          <w:sz w:val="22"/>
+          <w:rFonts w:ascii="Consolas" w:hAnsi="Consolas"/>
+          <w:shd w:val="clear" w:color="auto" w:fill="F4F4F4"/>
+        </w:rPr>
+        <w:t>switch-case</w:t>
+      </w:r>
+      <w:r>
+        <w:rPr>
+          <w:rFonts w:ascii="Calibri" w:hAnsi="Calibri"/>
+          <w:sz w:val="22"/>
+        </w:rPr>
+        <w:t xml:space="preserve"> (que requeriría modificar la fábrica cada vez que se añada una especie, violando el principio Open/Closed de SOLID), se implementó un registro dinámico (</w:t>
+      </w:r>
+      <w:r>
+        <w:rPr>
+          <w:rFonts w:ascii="Consolas" w:hAnsi="Consolas"/>
+          <w:sz w:val="22"/>
+          <w:rFonts w:ascii="Consolas" w:hAnsi="Consolas"/>
+          <w:shd w:val="clear" w:color="auto" w:fill="F4F4F4"/>
+        </w:rPr>
+        <w:t>Map&lt;String, Class&lt;? extends Animal&gt;&gt;</w:t>
+      </w:r>
+      <w:r>
+        <w:rPr>
+          <w:rFonts w:ascii="Calibri" w:hAnsi="Calibri"/>
+          <w:sz w:val="22"/>
+        </w:rPr>
+        <w:t>):</w:t>
+      </w:r>
+    </w:p>
+    <w:p>
+      <w:pPr>
+        <w:pStyle w:val="ListBullet"/>
+        <w:spacing w:after="40"/>
+        <w:ind w:left="340"/>
+      </w:pPr>
+      <w:r>
+        <w:rPr>
+          <w:rFonts w:ascii="Calibri" w:hAnsi="Calibri"/>
+          <w:b/>
+          <w:sz w:val="22"/>
+        </w:rPr>
+        <w:t>Registro</w:t>
+      </w:r>
+      <w:r>
+        <w:rPr>
+          <w:rFonts w:ascii="Calibri" w:hAnsi="Calibri"/>
+          <w:sz w:val="22"/>
+        </w:rPr>
+        <w:t>: Asocia un identificador en texto (</w:t>
+      </w:r>
+      <w:r>
+        <w:rPr>
+          <w:rFonts w:ascii="Consolas" w:hAnsi="Consolas"/>
+          <w:sz w:val="22"/>
+          <w:rFonts w:ascii="Consolas" w:hAnsi="Consolas"/>
+          <w:shd w:val="clear" w:color="auto" w:fill="F4F4F4"/>
+        </w:rPr>
+        <w:t>"perro"</w:t>
+      </w:r>
+      <w:r>
+        <w:rPr>
+          <w:rFonts w:ascii="Calibri" w:hAnsi="Calibri"/>
+          <w:sz w:val="22"/>
+        </w:rPr>
+        <w:t xml:space="preserve">, </w:t>
+      </w:r>
+      <w:r>
+        <w:rPr>
+          <w:rFonts w:ascii="Consolas" w:hAnsi="Consolas"/>
+          <w:sz w:val="22"/>
+          <w:rFonts w:ascii="Consolas" w:hAnsi="Consolas"/>
+          <w:shd w:val="clear" w:color="auto" w:fill="F4F4F4"/>
+        </w:rPr>
+        <w:t>"gato"</w:t>
+      </w:r>
+      <w:r>
+        <w:rPr>
+          <w:rFonts w:ascii="Calibri" w:hAnsi="Calibri"/>
+          <w:sz w:val="22"/>
+        </w:rPr>
+        <w:t xml:space="preserve">, </w:t>
+      </w:r>
+      <w:r>
+        <w:rPr>
+          <w:rFonts w:ascii="Consolas" w:hAnsi="Consolas"/>
+          <w:sz w:val="22"/>
+          <w:rFonts w:ascii="Consolas" w:hAnsi="Consolas"/>
+          <w:shd w:val="clear" w:color="auto" w:fill="F4F4F4"/>
+        </w:rPr>
+        <w:t>"conejo"</w:t>
+      </w:r>
+      <w:r>
+        <w:rPr>
+          <w:rFonts w:ascii="Calibri" w:hAnsi="Calibri"/>
+          <w:sz w:val="22"/>
+        </w:rPr>
+        <w:t>, etc.) con la clase correspondiente mediante reflexión de Java.</w:t>
+      </w:r>
+    </w:p>
+    <w:p>
+      <w:pPr>
+        <w:pStyle w:val="ListBullet"/>
+        <w:spacing w:after="40"/>
+        <w:ind w:left="340"/>
+      </w:pPr>
+      <w:r>
+        <w:rPr>
+          <w:rFonts w:ascii="Calibri" w:hAnsi="Calibri"/>
+          <w:b/>
+          <w:sz w:val="22"/>
+        </w:rPr>
+        <w:t>Creación</w:t>
+      </w:r>
+      <w:r>
+        <w:rPr>
+          <w:rFonts w:ascii="Calibri" w:hAnsi="Calibri"/>
+          <w:sz w:val="22"/>
+        </w:rPr>
+        <w:t xml:space="preserve">: El método estático </w:t>
+      </w:r>
+      <w:r>
+        <w:rPr>
+          <w:rFonts w:ascii="Consolas" w:hAnsi="Consolas"/>
+          <w:sz w:val="22"/>
+          <w:rFonts w:ascii="Consolas" w:hAnsi="Consolas"/>
+          <w:shd w:val="clear" w:color="auto" w:fill="F4F4F4"/>
+        </w:rPr>
+        <w:t>crear()</w:t>
+      </w:r>
+      <w:r>
+        <w:rPr>
+          <w:rFonts w:ascii="Calibri" w:hAnsi="Calibri"/>
+          <w:sz w:val="22"/>
+        </w:rPr>
+        <w:t xml:space="preserve"> busca la clase registrada y hace un llamado dinámico a su constructor, retornando una instancia polimórfica de tipo </w:t>
+      </w:r>
+      <w:r>
+        <w:rPr>
+          <w:rFonts w:ascii="Consolas" w:hAnsi="Consolas"/>
+          <w:sz w:val="22"/>
+          <w:rFonts w:ascii="Consolas" w:hAnsi="Consolas"/>
+          <w:shd w:val="clear" w:color="auto" w:fill="F4F4F4"/>
+        </w:rPr>
+        <w:t>Animal</w:t>
+      </w:r>
+      <w:r>
+        <w:rPr>
+          <w:rFonts w:ascii="Calibri" w:hAnsi="Calibri"/>
+          <w:sz w:val="22"/>
+        </w:rPr>
+        <w:t>.</w:t>
+      </w:r>
+    </w:p>
+    <w:p>
+      <w:pPr>
+        <w:pStyle w:val="ListBullet"/>
+        <w:spacing w:after="40"/>
+        <w:ind w:left="340"/>
+      </w:pPr>
+      <w:r>
+        <w:rPr>
+          <w:rFonts w:ascii="Calibri" w:hAnsi="Calibri"/>
+          <w:b/>
+          <w:sz w:val="22"/>
+        </w:rPr>
+        <w:t>Extensibilidad</w:t>
+      </w:r>
+      <w:r>
+        <w:rPr>
+          <w:rFonts w:ascii="Calibri" w:hAnsi="Calibri"/>
+          <w:sz w:val="22"/>
+        </w:rPr>
+        <w:t xml:space="preserve">: Permite registrar nuevos tipos de animales dinámicamente en tiempo de ejecución a través del método </w:t>
+      </w:r>
+      <w:r>
+        <w:rPr>
+          <w:rFonts w:ascii="Consolas" w:hAnsi="Consolas"/>
+          <w:sz w:val="22"/>
+          <w:rFonts w:ascii="Consolas" w:hAnsi="Consolas"/>
+          <w:shd w:val="clear" w:color="auto" w:fill="F4F4F4"/>
+        </w:rPr>
+        <w:t>registrar()</w:t>
+      </w:r>
+      <w:r>
+        <w:rPr>
+          <w:rFonts w:ascii="Calibri" w:hAnsi="Calibri"/>
+          <w:sz w:val="22"/>
+        </w:rPr>
+        <w:t>.</w:t>
+      </w:r>
+    </w:p>
+    <w:p>
+      <w:pPr>
+        <w:pStyle w:val="Heading3"/>
+      </w:pPr>
+      <w:r>
+        <w:rPr>
+          <w:rFonts w:ascii="Calibri" w:hAnsi="Calibri"/>
+          <w:b/>
+          <w:color w:val="1E293B"/>
+          <w:sz w:val="26"/>
+        </w:rPr>
+        <w:t>4.7.2 Builder Fluido (</w:t>
+      </w:r>
+      <w:r>
+        <w:rPr>
+          <w:rFonts w:ascii="Consolas" w:hAnsi="Consolas"/>
+          <w:b/>
+          <w:color w:val="1E293B"/>
+          <w:sz w:val="26"/>
+          <w:rFonts w:ascii="Consolas" w:hAnsi="Consolas"/>
+          <w:shd w:val="clear" w:color="auto" w:fill="F4F4F4"/>
+        </w:rPr>
+        <w:t>ConstructorAnimal</w:t>
+      </w:r>
+      <w:r>
+        <w:rPr>
+          <w:rFonts w:ascii="Calibri" w:hAnsi="Calibri"/>
+          <w:b/>
+          <w:color w:val="1E293B"/>
+          <w:sz w:val="26"/>
+        </w:rPr>
+        <w:t>)</w:t>
+      </w:r>
+    </w:p>
+    <w:p>
+      <w:pPr>
+        <w:ind w:firstLine="283"/>
+      </w:pPr>
+      <w:r>
+        <w:rPr>
+          <w:rFonts w:ascii="Calibri" w:hAnsi="Calibri"/>
+          <w:sz w:val="22"/>
+        </w:rPr>
+        <w:t xml:space="preserve">El patrón </w:t>
+      </w:r>
+      <w:r>
+        <w:rPr>
+          <w:rFonts w:ascii="Calibri" w:hAnsi="Calibri"/>
+          <w:b/>
+          <w:sz w:val="22"/>
+        </w:rPr>
+        <w:t>Builder</w:t>
+      </w:r>
+      <w:r>
+        <w:rPr>
+          <w:rFonts w:ascii="Calibri" w:hAnsi="Calibri"/>
+          <w:sz w:val="22"/>
+        </w:rPr>
+        <w:t xml:space="preserve"> provee una interfaz fluida (</w:t>
+      </w:r>
+      <w:r>
+        <w:rPr>
+          <w:rFonts w:ascii="Calibri" w:hAnsi="Calibri"/>
+          <w:i/>
+          <w:sz w:val="22"/>
+        </w:rPr>
+        <w:t>Fluent API</w:t>
+      </w:r>
+      <w:r>
+        <w:rPr>
+          <w:rFonts w:ascii="Calibri" w:hAnsi="Calibri"/>
+          <w:sz w:val="22"/>
+        </w:rPr>
+        <w:t>) para construir de forma clara y paso a paso instancias de animales sin lidiar con constructores gigantescos:</w:t>
+      </w:r>
+    </w:p>
+    <w:p>
+      <w:pPr>
+        <w:pStyle w:val="ListBullet"/>
+        <w:spacing w:after="40"/>
+        <w:ind w:left="340"/>
+      </w:pPr>
+      <w:r>
+        <w:rPr>
+          <w:rFonts w:ascii="Calibri" w:hAnsi="Calibri"/>
+          <w:sz w:val="22"/>
+        </w:rPr>
+        <w:t xml:space="preserve">Permite encadenar llamadas de configuración (ej. </w:t>
+      </w:r>
+      <w:r>
+        <w:rPr>
+          <w:rFonts w:ascii="Consolas" w:hAnsi="Consolas"/>
+          <w:sz w:val="22"/>
+          <w:rFonts w:ascii="Consolas" w:hAnsi="Consolas"/>
+          <w:shd w:val="clear" w:color="auto" w:fill="F4F4F4"/>
+        </w:rPr>
+        <w:t>new ConstructorAnimal("perro").conNombre("Bobby").conPeso(12.5f).construir()</w:t>
+      </w:r>
+      <w:r>
+        <w:rPr>
+          <w:rFonts w:ascii="Calibri" w:hAnsi="Calibri"/>
+          <w:sz w:val="22"/>
+        </w:rPr>
+        <w:t>).</w:t>
+      </w:r>
+    </w:p>
+    <w:p>
+      <w:pPr>
+        <w:pStyle w:val="ListBullet"/>
+        <w:spacing w:after="40"/>
+        <w:ind w:left="340"/>
+      </w:pPr>
+      <w:r>
+        <w:rPr>
+          <w:rFonts w:ascii="Calibri" w:hAnsi="Calibri"/>
+          <w:sz w:val="22"/>
+        </w:rPr>
+        <w:t xml:space="preserve">Encapsula la complejidad del orden de parámetros y delega la instanciación física al Factory dinámico </w:t>
+      </w:r>
+      <w:r>
+        <w:rPr>
+          <w:rFonts w:ascii="Consolas" w:hAnsi="Consolas"/>
+          <w:sz w:val="22"/>
+          <w:rFonts w:ascii="Consolas" w:hAnsi="Consolas"/>
+          <w:shd w:val="clear" w:color="auto" w:fill="F4F4F4"/>
+        </w:rPr>
+        <w:t>FabricaAnimalMap</w:t>
+      </w:r>
+      <w:r>
+        <w:rPr>
+          <w:rFonts w:ascii="Calibri" w:hAnsi="Calibri"/>
+          <w:sz w:val="22"/>
+        </w:rPr>
+        <w:t>.</w:t>
+      </w:r>
+    </w:p>
+    <w:p>
+      <w:pPr>
+        <w:pStyle w:val="Heading2"/>
+      </w:pPr>
+      <w:r>
+        <w:rPr>
+          <w:rFonts w:ascii="Calibri" w:hAnsi="Calibri"/>
+          <w:b/>
+          <w:color w:val="144B70"/>
+          <w:sz w:val="32"/>
+        </w:rPr>
+        <w:t>4.8 Estructura de paquetes</w:t>
       </w:r>
     </w:p>
     <w:tbl>
@@ -4655,13 +5378,15 @@
               </w:rPr>
               <w:t>poo_2026/</w:t>
               <w:br/>
-              <w:t>├── modelo/       → 15 clases (Animal, Perro, Gato, Persona, Responsable,</w:t>
+              <w:t>├── modelo/       → 18 clases y 2 enums (Animal, Perro, Gato, Conejo, Loro, Tortuga,</w:t>
               <w:br/>
-              <w:t>│                   Veterinario, Direccion, HistoriaClinica, Medicamento,</w:t>
+              <w:t>│                   Persona, Responsable, Veterinario, Direccion, HistoriaClinica,</w:t>
               <w:br/>
-              <w:t>│                   Vacuna, Turno, TipoTurno, TipoAlimentacion,</w:t>
+              <w:t>│                   Medicamento, Prescripcion, Vacuna, RegistroVacunacion, Turno,</w:t>
               <w:br/>
-              <w:t>│                   Veterinaria, ComprobanteTurno)</w:t>
+              <w:t>│                   TipoTurno, TipoAlimentacion, Veterinaria, ComprobanteTurno)</w:t>
+              <w:br/>
+              <w:t>├── fabrica/      → Creación desacoplada (FabricaAnimalMap, ConstructorAnimal)</w:t>
               <w:br/>
               <w:t>├── vista/        → PortalVeterinario + subpaquetes paneles/ y dialogos/</w:t>
               <w:br/>
@@ -4675,7 +5400,7 @@
               <w:br/>
               <w:t>├── Main.java     → launcher</w:t>
               <w:br/>
-              <w:t>├── Demo.java     → 59 pruebas integrales</w:t>
+              <w:t>├── Demo.java     → 62 pruebas integrales</w:t>
               <w:br/>
               <w:t>└── README.md</w:t>
             </w:r>
@@ -5869,12 +6594,14 @@
               <w:br/>
               <w:t xml:space="preserve">  Sección 9: Composición y agregación                4/4 ✓</w:t>
               <w:br/>
-              <w:t xml:space="preserve">  Sección 10: Cierre de sesión                       2/2 ✓</w:t>
+              <w:t xml:space="preserve">  Sección 10: Presentación de combos                 3/3 ✓</w:t>
+              <w:br/>
+              <w:t xml:space="preserve">  Sección 11: Cierre de sesión                       2/2 ✓</w:t>
               <w:br/>
               <w:br/>
               <w:t>══════════════════════════════════════════</w:t>
               <w:br/>
-              <w:t xml:space="preserve">  Resultado: 59 pasadas, 0 fallidas</w:t>
+              <w:t xml:space="preserve">  Resultado: 62 pasadas, 0 fallidas</w:t>
               <w:br/>
               <w:t>══════════════════════════════════════════</w:t>
             </w:r>
@@ -7123,7 +7850,7 @@
       <w:r>
         <w:drawing>
           <wp:inline xmlns:a="http://schemas.openxmlformats.org/drawingml/2006/main" xmlns:pic="http://schemas.openxmlformats.org/drawingml/2006/picture">
-            <wp:extent cx="5943600" cy="5253326"/>
+            <wp:extent cx="5943600" cy="5203552"/>
             <wp:docPr id="1" name="Picture 1"/>
             <wp:cNvGraphicFramePr>
               <a:graphicFrameLocks noChangeAspect="1"/>
@@ -7144,7 +7871,7 @@
                   <pic:spPr>
                     <a:xfrm>
                       <a:off x="0" y="0"/>
-                      <a:ext cx="5943600" cy="5253326"/>
+                      <a:ext cx="5943600" cy="5203552"/>
                     </a:xfrm>
                     <a:prstGeom prst="rect"/>
                   </pic:spPr>

</xml_diff>